<commit_message>
Initial clean Playwright project
</commit_message>
<xml_diff>
--- a/Install and Run Files/Install Playwright and command lines.docx
+++ b/Install and Run Files/Install Playwright and command lines.docx
@@ -5459,20 +5459,10 @@
                 <w:szCs w:val="21"/>
                 <w:shd w:val="clear" w:color="auto" w:fill="FFFFFF"/>
               </w:rPr>
-              <w:t xml:space="preserve"> branch -</w:t>
-            </w:r>
-            <w:proofErr w:type="spellStart"/>
-            <w:r>
-              <w:rPr>
-                <w:rFonts w:ascii="Consolas" w:hAnsi="Consolas"/>
-                <w:color w:val="000000"/>
-                <w:sz w:val="21"/>
-                <w:szCs w:val="21"/>
-                <w:shd w:val="clear" w:color="auto" w:fill="FFFFFF"/>
-              </w:rPr>
-              <w:t>vv</w:t>
-            </w:r>
-            <w:proofErr w:type="spellEnd"/>
+              <w:t xml:space="preserve"> branch -v</w:t>
+            </w:r>
+            <w:bookmarkStart w:id="0" w:name="_GoBack"/>
+            <w:bookmarkEnd w:id="0"/>
           </w:p>
           <w:p>
             <w:pPr>
@@ -5780,8 +5770,7 @@
                 <w:shd w:val="clear" w:color="auto" w:fill="FFFFFF"/>
               </w:rPr>
             </w:pPr>
-            <w:bookmarkStart w:id="0" w:name="_GoBack"/>
-            <w:bookmarkEnd w:id="0"/>
+            <w:proofErr w:type="spellStart"/>
             <w:r>
               <w:rPr>
                 <w:rFonts w:ascii="Courier New" w:eastAsia="Times New Roman" w:hAnsi="Courier New" w:cs="Courier New"/>
@@ -5789,9 +5778,9 @@
                 <w:sz w:val="20"/>
                 <w:szCs w:val="20"/>
               </w:rPr>
-              <w:t>rm -f ~/.</w:t>
-            </w:r>
-            <w:proofErr w:type="spellStart"/>
+              <w:t>rm</w:t>
+            </w:r>
+            <w:proofErr w:type="spellEnd"/>
             <w:r>
               <w:rPr>
                 <w:rFonts w:ascii="Courier New" w:eastAsia="Times New Roman" w:hAnsi="Courier New" w:cs="Courier New"/>
@@ -5799,9 +5788,9 @@
                 <w:sz w:val="20"/>
                 <w:szCs w:val="20"/>
               </w:rPr>
-              <w:t>git</w:t>
-            </w:r>
-            <w:proofErr w:type="spellEnd"/>
+              <w:t xml:space="preserve"> -f ~/.</w:t>
+            </w:r>
+            <w:proofErr w:type="spellStart"/>
             <w:r>
               <w:rPr>
                 <w:rFonts w:ascii="Courier New" w:eastAsia="Times New Roman" w:hAnsi="Courier New" w:cs="Courier New"/>
@@ -5809,19 +5798,18 @@
                 <w:sz w:val="20"/>
                 <w:szCs w:val="20"/>
               </w:rPr>
+              <w:t>git</w:t>
+            </w:r>
+            <w:proofErr w:type="spellEnd"/>
+            <w:r>
+              <w:rPr>
+                <w:rFonts w:ascii="Courier New" w:eastAsia="Times New Roman" w:hAnsi="Courier New" w:cs="Courier New"/>
+                <w:color w:val="FF0000"/>
+                <w:sz w:val="20"/>
+                <w:szCs w:val="20"/>
+              </w:rPr>
               <w:t>-credentials</w:t>
             </w:r>
-          </w:p>
-          <w:p>
-            <w:pPr>
-              <w:rPr>
-                <w:rFonts w:ascii="Consolas" w:hAnsi="Consolas"/>
-                <w:color w:val="FF0000"/>
-                <w:sz w:val="21"/>
-                <w:szCs w:val="21"/>
-                <w:shd w:val="clear" w:color="auto" w:fill="FFFFFF"/>
-              </w:rPr>
-            </w:pPr>
           </w:p>
           <w:p>
             <w:pPr>
@@ -5874,17 +5862,6 @@
           </w:p>
           <w:p>
             <w:pPr>
-              <w:rPr>
-                <w:rFonts w:ascii="Consolas" w:hAnsi="Consolas"/>
-                <w:color w:val="FF0000"/>
-                <w:sz w:val="21"/>
-                <w:szCs w:val="21"/>
-                <w:shd w:val="clear" w:color="auto" w:fill="FFFFFF"/>
-              </w:rPr>
-            </w:pPr>
-          </w:p>
-          <w:p>
-            <w:pPr>
               <w:tabs>
                 <w:tab w:val="left" w:pos="916"/>
                 <w:tab w:val="left" w:pos="1832"/>
@@ -5911,17 +5888,36 @@
                 <w:szCs w:val="20"/>
               </w:rPr>
             </w:pPr>
-            <w:proofErr w:type="spellStart"/>
-            <w:r>
+          </w:p>
+          <w:p>
+            <w:pPr>
+              <w:tabs>
+                <w:tab w:val="left" w:pos="916"/>
+                <w:tab w:val="left" w:pos="1832"/>
+                <w:tab w:val="left" w:pos="2748"/>
+                <w:tab w:val="left" w:pos="3664"/>
+                <w:tab w:val="left" w:pos="4580"/>
+                <w:tab w:val="left" w:pos="5496"/>
+                <w:tab w:val="left" w:pos="6412"/>
+                <w:tab w:val="left" w:pos="7328"/>
+                <w:tab w:val="left" w:pos="8244"/>
+                <w:tab w:val="left" w:pos="9160"/>
+                <w:tab w:val="left" w:pos="10076"/>
+                <w:tab w:val="left" w:pos="10992"/>
+                <w:tab w:val="left" w:pos="11908"/>
+                <w:tab w:val="left" w:pos="12824"/>
+                <w:tab w:val="left" w:pos="13740"/>
+                <w:tab w:val="left" w:pos="14656"/>
+              </w:tabs>
+              <w:spacing w:after="0" w:line="240" w:lineRule="auto"/>
               <w:rPr>
                 <w:rFonts w:ascii="Courier New" w:eastAsia="Times New Roman" w:hAnsi="Courier New" w:cs="Courier New"/>
                 <w:color w:val="FF0000"/>
                 <w:sz w:val="20"/>
                 <w:szCs w:val="20"/>
               </w:rPr>
-              <w:t>git</w:t>
-            </w:r>
-            <w:proofErr w:type="spellEnd"/>
+            </w:pPr>
+            <w:proofErr w:type="spellStart"/>
             <w:r>
               <w:rPr>
                 <w:rFonts w:ascii="Courier New" w:eastAsia="Times New Roman" w:hAnsi="Courier New" w:cs="Courier New"/>
@@ -5929,9 +5925,9 @@
                 <w:sz w:val="20"/>
                 <w:szCs w:val="20"/>
               </w:rPr>
-              <w:t xml:space="preserve"> remote set-</w:t>
-            </w:r>
-            <w:proofErr w:type="spellStart"/>
+              <w:t>git</w:t>
+            </w:r>
+            <w:proofErr w:type="spellEnd"/>
             <w:r>
               <w:rPr>
                 <w:rFonts w:ascii="Courier New" w:eastAsia="Times New Roman" w:hAnsi="Courier New" w:cs="Courier New"/>
@@ -5939,9 +5935,9 @@
                 <w:sz w:val="20"/>
                 <w:szCs w:val="20"/>
               </w:rPr>
-              <w:t>url</w:t>
-            </w:r>
-            <w:proofErr w:type="spellEnd"/>
+              <w:t xml:space="preserve"> remote set-</w:t>
+            </w:r>
+            <w:proofErr w:type="spellStart"/>
             <w:r>
               <w:rPr>
                 <w:rFonts w:ascii="Courier New" w:eastAsia="Times New Roman" w:hAnsi="Courier New" w:cs="Courier New"/>
@@ -5949,17 +5945,45 @@
                 <w:sz w:val="20"/>
                 <w:szCs w:val="20"/>
               </w:rPr>
+              <w:t>url</w:t>
+            </w:r>
+            <w:proofErr w:type="spellEnd"/>
+            <w:r>
+              <w:rPr>
+                <w:rFonts w:ascii="Courier New" w:eastAsia="Times New Roman" w:hAnsi="Courier New" w:cs="Courier New"/>
+                <w:color w:val="FF0000"/>
+                <w:sz w:val="20"/>
+                <w:szCs w:val="20"/>
+              </w:rPr>
               <w:t xml:space="preserve"> origin https://github.com/galmuradi/PlaywrightSep_2026.git</w:t>
             </w:r>
           </w:p>
           <w:p>
             <w:pPr>
-              <w:rPr>
-                <w:rFonts w:ascii="Consolas" w:hAnsi="Consolas"/>
-                <w:color w:val="FF0000"/>
-                <w:sz w:val="21"/>
-                <w:szCs w:val="21"/>
-                <w:shd w:val="clear" w:color="auto" w:fill="FFFFFF"/>
+              <w:tabs>
+                <w:tab w:val="left" w:pos="916"/>
+                <w:tab w:val="left" w:pos="1832"/>
+                <w:tab w:val="left" w:pos="2748"/>
+                <w:tab w:val="left" w:pos="3664"/>
+                <w:tab w:val="left" w:pos="4580"/>
+                <w:tab w:val="left" w:pos="5496"/>
+                <w:tab w:val="left" w:pos="6412"/>
+                <w:tab w:val="left" w:pos="7328"/>
+                <w:tab w:val="left" w:pos="8244"/>
+                <w:tab w:val="left" w:pos="9160"/>
+                <w:tab w:val="left" w:pos="10076"/>
+                <w:tab w:val="left" w:pos="10992"/>
+                <w:tab w:val="left" w:pos="11908"/>
+                <w:tab w:val="left" w:pos="12824"/>
+                <w:tab w:val="left" w:pos="13740"/>
+                <w:tab w:val="left" w:pos="14656"/>
+              </w:tabs>
+              <w:spacing w:after="0" w:line="240" w:lineRule="auto"/>
+              <w:rPr>
+                <w:rFonts w:ascii="Courier New" w:eastAsia="Times New Roman" w:hAnsi="Courier New" w:cs="Courier New"/>
+                <w:color w:val="FF0000"/>
+                <w:sz w:val="20"/>
+                <w:szCs w:val="20"/>
               </w:rPr>
             </w:pPr>
           </w:p>

</xml_diff>